<commit_message>
Refactor index.html for improved layout and styling; update project descriptions and links; enhance contact form and messaging sections.
</commit_message>
<xml_diff>
--- a/dewey-documentation.docx
+++ b/dewey-documentation.docx
@@ -107,10 +107,10 @@
           <w:noProof/>
         </w:rPr>
         <w:drawing>
-          <wp:inline distT="0" distB="0" distL="0" distR="0" wp14:anchorId="7A95BE5B" wp14:editId="3AC4B4E2">
-            <wp:extent cx="1885950" cy="1885950"/>
-            <wp:effectExtent l="0" t="0" r="0" b="0"/>
-            <wp:docPr id="1549291818" name="Picture 1" descr="Turing Tech logo"/>
+          <wp:inline distT="0" distB="0" distL="0" distR="0" wp14:anchorId="7A95BE5B" wp14:editId="5FD4CF61">
+            <wp:extent cx="1537589" cy="1885950"/>
+            <wp:effectExtent l="0" t="0" r="5715" b="0"/>
+            <wp:docPr id="1549291818" name="Picture 1"/>
             <wp:cNvGraphicFramePr>
               <a:graphicFrameLocks xmlns:a="http://schemas.openxmlformats.org/drawingml/2006/main" noChangeAspect="1"/>
             </wp:cNvGraphicFramePr>
@@ -118,7 +118,7 @@
               <a:graphicData uri="http://schemas.openxmlformats.org/drawingml/2006/picture">
                 <pic:pic xmlns:pic="http://schemas.openxmlformats.org/drawingml/2006/picture">
                   <pic:nvPicPr>
-                    <pic:cNvPr id="0" name="Picture 1" descr="Turing Tech logo"/>
+                    <pic:cNvPr id="1549291818" name="Picture 1"/>
                     <pic:cNvPicPr>
                       <a:picLocks noChangeAspect="1" noChangeArrowheads="1"/>
                     </pic:cNvPicPr>
@@ -131,7 +131,6 @@
                         </a:ext>
                       </a:extLst>
                     </a:blip>
-                    <a:srcRect/>
                     <a:stretch>
                       <a:fillRect/>
                     </a:stretch>
@@ -139,9 +138,9 @@
                   <pic:spPr bwMode="auto">
                     <a:xfrm>
                       <a:off x="0" y="0"/>
-                      <a:ext cx="1885950" cy="1885950"/>
+                      <a:ext cx="1537589" cy="1885950"/>
                     </a:xfrm>
-                    <a:prstGeom prst="rect">
+                    <a:prstGeom prst="roundRect">
                       <a:avLst/>
                     </a:prstGeom>
                     <a:noFill/>
@@ -271,7 +270,18 @@
           <w:szCs w:val="22"/>
           <w14:ligatures w14:val="none"/>
         </w:rPr>
-        <w:t>4 (Landing Page)</w:t>
+        <w:t>2</w:t>
+      </w:r>
+      <w:r>
+        <w:rPr>
+          <w:rFonts w:ascii="Aptos Narrow" w:eastAsia="Times New Roman" w:hAnsi="Aptos Narrow" w:cs="Times New Roman"/>
+          <w:color w:val="000000"/>
+          <w:kern w:val="0"/>
+          <w:sz w:val="22"/>
+          <w:szCs w:val="22"/>
+          <w14:ligatures w14:val="none"/>
+        </w:rPr>
+        <w:t xml:space="preserve"> (Landing Page)</w:t>
       </w:r>
     </w:p>
     <w:p>
@@ -665,7 +675,7 @@
           <w:szCs w:val="22"/>
           <w14:ligatures w14:val="none"/>
         </w:rPr>
-        <w:t>PostGreSQL</w:t>
+        <w:t>Nil</w:t>
       </w:r>
     </w:p>
     <w:p>
@@ -823,7 +833,29 @@
           <w14:ligatures w14:val="none"/>
         </w:rPr>
         <w:tab/>
-        <w:t>Website with a minor database</w:t>
+        <w:t xml:space="preserve">Website with </w:t>
+      </w:r>
+      <w:r>
+        <w:rPr>
+          <w:rFonts w:ascii="Aptos Narrow" w:eastAsia="Times New Roman" w:hAnsi="Aptos Narrow" w:cs="Times New Roman"/>
+          <w:color w:val="000000"/>
+          <w:kern w:val="0"/>
+          <w:sz w:val="22"/>
+          <w:szCs w:val="22"/>
+          <w14:ligatures w14:val="none"/>
+        </w:rPr>
+        <w:t>no</w:t>
+      </w:r>
+      <w:r>
+        <w:rPr>
+          <w:rFonts w:ascii="Aptos Narrow" w:eastAsia="Times New Roman" w:hAnsi="Aptos Narrow" w:cs="Times New Roman"/>
+          <w:color w:val="000000"/>
+          <w:kern w:val="0"/>
+          <w:sz w:val="22"/>
+          <w:szCs w:val="22"/>
+          <w14:ligatures w14:val="none"/>
+        </w:rPr>
+        <w:t xml:space="preserve"> database</w:t>
       </w:r>
     </w:p>
     <w:p>
@@ -1038,143 +1070,419 @@
     </w:p>
     <w:p>
       <w:pPr>
-        <w:rPr>
-          <w:rFonts w:ascii="Aptos Narrow" w:eastAsia="Times New Roman" w:hAnsi="Aptos Narrow" w:cs="Times New Roman"/>
-          <w:b/>
-          <w:bCs/>
-          <w:color w:val="000000"/>
-          <w:kern w:val="0"/>
-          <w:sz w:val="22"/>
-          <w:szCs w:val="22"/>
-          <w14:ligatures w14:val="none"/>
-        </w:rPr>
-      </w:pPr>
-    </w:p>
-    <w:p>
-      <w:pPr>
-        <w:rPr>
-          <w:rFonts w:ascii="Aptos Narrow" w:eastAsia="Times New Roman" w:hAnsi="Aptos Narrow" w:cs="Times New Roman"/>
-          <w:b/>
-          <w:bCs/>
-          <w:color w:val="000000"/>
-          <w:kern w:val="0"/>
-          <w:sz w:val="22"/>
-          <w:szCs w:val="22"/>
-          <w14:ligatures w14:val="none"/>
-        </w:rPr>
-      </w:pPr>
-    </w:p>
-    <w:p>
-      <w:pPr>
-        <w:rPr>
-          <w:rFonts w:ascii="Aptos Narrow" w:eastAsia="Times New Roman" w:hAnsi="Aptos Narrow" w:cs="Times New Roman"/>
-          <w:b/>
-          <w:bCs/>
-          <w:color w:val="000000"/>
-          <w:kern w:val="0"/>
-          <w:sz w:val="22"/>
-          <w:szCs w:val="22"/>
-          <w14:ligatures w14:val="none"/>
-        </w:rPr>
-      </w:pPr>
-    </w:p>
-    <w:p>
-      <w:pPr>
-        <w:rPr>
-          <w:rFonts w:ascii="Aptos Narrow" w:eastAsia="Times New Roman" w:hAnsi="Aptos Narrow" w:cs="Times New Roman"/>
-          <w:b/>
-          <w:bCs/>
-          <w:color w:val="000000"/>
-          <w:kern w:val="0"/>
-          <w:sz w:val="22"/>
-          <w:szCs w:val="22"/>
-          <w14:ligatures w14:val="none"/>
-        </w:rPr>
-      </w:pPr>
-    </w:p>
-    <w:p>
-      <w:pPr>
-        <w:rPr>
-          <w:rFonts w:ascii="Aptos Narrow" w:eastAsia="Times New Roman" w:hAnsi="Aptos Narrow" w:cs="Times New Roman"/>
-          <w:b/>
-          <w:bCs/>
-          <w:color w:val="000000"/>
-          <w:kern w:val="0"/>
-          <w:sz w:val="22"/>
-          <w:szCs w:val="22"/>
-          <w14:ligatures w14:val="none"/>
-        </w:rPr>
-      </w:pPr>
-    </w:p>
-    <w:p>
-      <w:pPr>
-        <w:rPr>
-          <w:rFonts w:ascii="Aptos Narrow" w:eastAsia="Times New Roman" w:hAnsi="Aptos Narrow" w:cs="Times New Roman"/>
-          <w:b/>
-          <w:bCs/>
-          <w:color w:val="000000"/>
-          <w:kern w:val="0"/>
-          <w:sz w:val="22"/>
-          <w:szCs w:val="22"/>
-          <w14:ligatures w14:val="none"/>
-        </w:rPr>
-      </w:pPr>
-    </w:p>
-    <w:p>
-      <w:pPr>
-        <w:rPr>
-          <w:rFonts w:ascii="Aptos Narrow" w:eastAsia="Times New Roman" w:hAnsi="Aptos Narrow" w:cs="Times New Roman"/>
-          <w:b/>
-          <w:bCs/>
-          <w:color w:val="000000"/>
-          <w:kern w:val="0"/>
-          <w:sz w:val="22"/>
-          <w:szCs w:val="22"/>
-          <w14:ligatures w14:val="none"/>
-        </w:rPr>
-      </w:pPr>
-    </w:p>
-    <w:p>
-      <w:pPr>
-        <w:rPr>
-          <w:rFonts w:ascii="Aptos Narrow" w:eastAsia="Times New Roman" w:hAnsi="Aptos Narrow" w:cs="Times New Roman"/>
-          <w:b/>
-          <w:bCs/>
-          <w:color w:val="000000"/>
-          <w:kern w:val="0"/>
-          <w:sz w:val="22"/>
-          <w:szCs w:val="22"/>
-          <w14:ligatures w14:val="none"/>
-        </w:rPr>
-      </w:pPr>
-    </w:p>
-    <w:p>
-      <w:pPr>
-        <w:rPr>
-          <w:rFonts w:ascii="Aptos Narrow" w:eastAsia="Times New Roman" w:hAnsi="Aptos Narrow" w:cs="Times New Roman"/>
-          <w:b/>
-          <w:bCs/>
-          <w:color w:val="000000"/>
-          <w:kern w:val="0"/>
-          <w:sz w:val="22"/>
-          <w:szCs w:val="22"/>
-          <w14:ligatures w14:val="none"/>
-        </w:rPr>
-      </w:pPr>
-    </w:p>
-    <w:p>
-      <w:pPr>
-        <w:rPr>
-          <w:rFonts w:ascii="Aptos Narrow" w:eastAsia="Times New Roman" w:hAnsi="Aptos Narrow" w:cs="Times New Roman"/>
-          <w:b/>
-          <w:bCs/>
-          <w:color w:val="000000"/>
-          <w:kern w:val="0"/>
-          <w:sz w:val="22"/>
-          <w:szCs w:val="22"/>
-          <w14:ligatures w14:val="none"/>
-        </w:rPr>
-      </w:pPr>
+        <w:spacing w:after="0" w:line="240" w:lineRule="auto"/>
+        <w:rPr>
+          <w:rFonts w:eastAsia="Times New Roman" w:cstheme="minorHAnsi"/>
+          <w:b/>
+          <w:bCs/>
+          <w:color w:val="000000"/>
+          <w:sz w:val="40"/>
+          <w:szCs w:val="40"/>
+        </w:rPr>
+      </w:pPr>
+      <w:r>
+        <w:rPr>
+          <w:rFonts w:eastAsia="Times New Roman" w:cstheme="minorHAnsi"/>
+          <w:b/>
+          <w:bCs/>
+          <w:color w:val="000000"/>
+          <w:sz w:val="40"/>
+          <w:szCs w:val="40"/>
+        </w:rPr>
+        <w:lastRenderedPageBreak/>
+        <w:t>PURPOSE OF DOCUMENT</w:t>
+      </w:r>
+    </w:p>
+    <w:p>
+      <w:pPr>
+        <w:pStyle w:val="ListParagraph"/>
+        <w:numPr>
+          <w:ilvl w:val="0"/>
+          <w:numId w:val="2"/>
+        </w:numPr>
+        <w:spacing w:after="0" w:line="240" w:lineRule="auto"/>
+        <w:rPr>
+          <w:rFonts w:eastAsia="Times New Roman" w:cstheme="minorHAnsi"/>
+          <w:b/>
+          <w:bCs/>
+          <w:color w:val="000000"/>
+          <w:sz w:val="28"/>
+          <w:szCs w:val="28"/>
+        </w:rPr>
+      </w:pPr>
+      <w:r>
+        <w:rPr>
+          <w:rFonts w:eastAsia="Times New Roman" w:cstheme="minorHAnsi"/>
+          <w:bCs/>
+          <w:color w:val="000000"/>
+          <w:sz w:val="28"/>
+          <w:szCs w:val="28"/>
+        </w:rPr>
+        <w:t>Version Management</w:t>
+      </w:r>
+    </w:p>
+    <w:p>
+      <w:pPr>
+        <w:pStyle w:val="ListParagraph"/>
+        <w:numPr>
+          <w:ilvl w:val="0"/>
+          <w:numId w:val="2"/>
+        </w:numPr>
+        <w:spacing w:after="0" w:line="240" w:lineRule="auto"/>
+        <w:rPr>
+          <w:rFonts w:eastAsia="Times New Roman" w:cstheme="minorHAnsi"/>
+          <w:b/>
+          <w:bCs/>
+          <w:color w:val="000000"/>
+          <w:sz w:val="28"/>
+          <w:szCs w:val="28"/>
+        </w:rPr>
+      </w:pPr>
+      <w:r>
+        <w:rPr>
+          <w:rFonts w:eastAsia="Times New Roman" w:cstheme="minorHAnsi"/>
+          <w:bCs/>
+          <w:color w:val="000000"/>
+          <w:sz w:val="28"/>
+          <w:szCs w:val="28"/>
+        </w:rPr>
+        <w:t>Technical Support</w:t>
+      </w:r>
+    </w:p>
+    <w:p>
+      <w:pPr>
+        <w:pStyle w:val="ListParagraph"/>
+        <w:numPr>
+          <w:ilvl w:val="0"/>
+          <w:numId w:val="2"/>
+        </w:numPr>
+        <w:spacing w:after="0" w:line="240" w:lineRule="auto"/>
+        <w:rPr>
+          <w:rFonts w:eastAsia="Times New Roman" w:cstheme="minorHAnsi"/>
+          <w:b/>
+          <w:bCs/>
+          <w:color w:val="000000"/>
+          <w:sz w:val="28"/>
+          <w:szCs w:val="28"/>
+        </w:rPr>
+      </w:pPr>
+      <w:r>
+        <w:rPr>
+          <w:rFonts w:eastAsia="Times New Roman" w:cstheme="minorHAnsi"/>
+          <w:bCs/>
+          <w:color w:val="000000"/>
+          <w:sz w:val="28"/>
+          <w:szCs w:val="28"/>
+        </w:rPr>
+        <w:t>Functional Spec team</w:t>
+      </w:r>
+    </w:p>
+    <w:p>
+      <w:pPr>
+        <w:pStyle w:val="ListParagraph"/>
+        <w:numPr>
+          <w:ilvl w:val="0"/>
+          <w:numId w:val="2"/>
+        </w:numPr>
+        <w:spacing w:after="0" w:line="240" w:lineRule="auto"/>
+        <w:rPr>
+          <w:rFonts w:eastAsia="Times New Roman" w:cstheme="minorHAnsi"/>
+          <w:b/>
+          <w:bCs/>
+          <w:color w:val="000000"/>
+          <w:sz w:val="28"/>
+          <w:szCs w:val="28"/>
+        </w:rPr>
+      </w:pPr>
+      <w:r>
+        <w:rPr>
+          <w:rFonts w:eastAsia="Times New Roman" w:cstheme="minorHAnsi"/>
+          <w:bCs/>
+          <w:color w:val="000000"/>
+          <w:sz w:val="28"/>
+          <w:szCs w:val="28"/>
+        </w:rPr>
+        <w:t>Programming team</w:t>
+      </w:r>
+    </w:p>
+    <w:p>
+      <w:pPr>
+        <w:pStyle w:val="ListParagraph"/>
+        <w:numPr>
+          <w:ilvl w:val="0"/>
+          <w:numId w:val="2"/>
+        </w:numPr>
+        <w:spacing w:after="0" w:line="240" w:lineRule="auto"/>
+        <w:rPr>
+          <w:rFonts w:eastAsia="Times New Roman" w:cstheme="minorHAnsi"/>
+          <w:b/>
+          <w:bCs/>
+          <w:color w:val="000000"/>
+          <w:sz w:val="28"/>
+          <w:szCs w:val="28"/>
+        </w:rPr>
+      </w:pPr>
+      <w:r>
+        <w:rPr>
+          <w:rFonts w:eastAsia="Times New Roman" w:cstheme="minorHAnsi"/>
+          <w:bCs/>
+          <w:color w:val="000000"/>
+          <w:sz w:val="28"/>
+          <w:szCs w:val="28"/>
+        </w:rPr>
+        <w:t>Intellectual Property Filing</w:t>
+      </w:r>
+    </w:p>
+    <w:p>
+      <w:pPr>
+        <w:pStyle w:val="ListParagraph"/>
+        <w:numPr>
+          <w:ilvl w:val="0"/>
+          <w:numId w:val="2"/>
+        </w:numPr>
+        <w:spacing w:after="0" w:line="240" w:lineRule="auto"/>
+        <w:rPr>
+          <w:rFonts w:eastAsia="Times New Roman" w:cstheme="minorHAnsi"/>
+          <w:b/>
+          <w:bCs/>
+          <w:color w:val="000000"/>
+          <w:sz w:val="28"/>
+          <w:szCs w:val="28"/>
+        </w:rPr>
+      </w:pPr>
+      <w:r>
+        <w:rPr>
+          <w:rFonts w:eastAsia="Times New Roman" w:cstheme="minorHAnsi"/>
+          <w:bCs/>
+          <w:color w:val="000000"/>
+          <w:sz w:val="28"/>
+          <w:szCs w:val="28"/>
+        </w:rPr>
+        <w:t>Trade Mark Purposes</w:t>
+      </w:r>
+    </w:p>
+    <w:p>
+      <w:pPr>
+        <w:pStyle w:val="ListParagraph"/>
+        <w:numPr>
+          <w:ilvl w:val="0"/>
+          <w:numId w:val="2"/>
+        </w:numPr>
+        <w:spacing w:after="0" w:line="240" w:lineRule="auto"/>
+        <w:rPr>
+          <w:rFonts w:eastAsia="Times New Roman" w:cstheme="minorHAnsi"/>
+          <w:b/>
+          <w:bCs/>
+          <w:color w:val="000000"/>
+          <w:sz w:val="28"/>
+          <w:szCs w:val="28"/>
+        </w:rPr>
+      </w:pPr>
+      <w:r>
+        <w:rPr>
+          <w:rFonts w:eastAsia="Times New Roman" w:cstheme="minorHAnsi"/>
+          <w:bCs/>
+          <w:color w:val="000000"/>
+          <w:sz w:val="28"/>
+          <w:szCs w:val="28"/>
+        </w:rPr>
+        <w:t>Copyright Purposes</w:t>
+      </w:r>
+    </w:p>
+    <w:p>
+      <w:pPr>
+        <w:pStyle w:val="ListParagraph"/>
+        <w:numPr>
+          <w:ilvl w:val="0"/>
+          <w:numId w:val="2"/>
+        </w:numPr>
+        <w:spacing w:after="0" w:line="240" w:lineRule="auto"/>
+        <w:rPr>
+          <w:rFonts w:eastAsia="Times New Roman" w:cstheme="minorHAnsi"/>
+          <w:b/>
+          <w:bCs/>
+          <w:color w:val="000000"/>
+          <w:sz w:val="28"/>
+          <w:szCs w:val="28"/>
+        </w:rPr>
+      </w:pPr>
+      <w:r>
+        <w:rPr>
+          <w:rFonts w:eastAsia="Times New Roman" w:cstheme="minorHAnsi"/>
+          <w:bCs/>
+          <w:color w:val="000000"/>
+          <w:sz w:val="28"/>
+          <w:szCs w:val="28"/>
+        </w:rPr>
+        <w:t>Other Miscellaneous Purposes</w:t>
+      </w:r>
+    </w:p>
+    <w:p>
+      <w:pPr>
+        <w:rPr>
+          <w:rFonts w:ascii="Aptos Narrow" w:eastAsia="Times New Roman" w:hAnsi="Aptos Narrow" w:cs="Times New Roman"/>
+          <w:b/>
+          <w:bCs/>
+          <w:color w:val="000000"/>
+          <w:kern w:val="0"/>
+          <w:sz w:val="22"/>
+          <w:szCs w:val="22"/>
+          <w14:ligatures w14:val="none"/>
+        </w:rPr>
+      </w:pPr>
+    </w:p>
+    <w:p>
+      <w:pPr>
+        <w:rPr>
+          <w:rFonts w:ascii="Aptos Narrow" w:eastAsia="Times New Roman" w:hAnsi="Aptos Narrow" w:cs="Times New Roman"/>
+          <w:b/>
+          <w:bCs/>
+          <w:color w:val="000000"/>
+          <w:kern w:val="0"/>
+          <w:sz w:val="22"/>
+          <w:szCs w:val="22"/>
+          <w14:ligatures w14:val="none"/>
+        </w:rPr>
+      </w:pPr>
+    </w:p>
+    <w:p>
+      <w:pPr>
+        <w:rPr>
+          <w:rFonts w:ascii="Aptos Narrow" w:eastAsia="Times New Roman" w:hAnsi="Aptos Narrow" w:cs="Times New Roman"/>
+          <w:b/>
+          <w:bCs/>
+          <w:color w:val="000000"/>
+          <w:kern w:val="0"/>
+          <w:sz w:val="22"/>
+          <w:szCs w:val="22"/>
+          <w14:ligatures w14:val="none"/>
+        </w:rPr>
+      </w:pPr>
+    </w:p>
+    <w:p>
+      <w:pPr>
+        <w:rPr>
+          <w:rFonts w:ascii="Aptos Narrow" w:eastAsia="Times New Roman" w:hAnsi="Aptos Narrow" w:cs="Times New Roman"/>
+          <w:b/>
+          <w:bCs/>
+          <w:color w:val="000000"/>
+          <w:kern w:val="0"/>
+          <w:sz w:val="22"/>
+          <w:szCs w:val="22"/>
+          <w14:ligatures w14:val="none"/>
+        </w:rPr>
+      </w:pPr>
+    </w:p>
+    <w:p>
+      <w:pPr>
+        <w:rPr>
+          <w:rFonts w:ascii="Aptos Narrow" w:eastAsia="Times New Roman" w:hAnsi="Aptos Narrow" w:cs="Times New Roman"/>
+          <w:b/>
+          <w:bCs/>
+          <w:color w:val="000000"/>
+          <w:kern w:val="0"/>
+          <w:sz w:val="22"/>
+          <w:szCs w:val="22"/>
+          <w14:ligatures w14:val="none"/>
+        </w:rPr>
+      </w:pPr>
+    </w:p>
+    <w:p>
+      <w:pPr>
+        <w:rPr>
+          <w:rFonts w:ascii="Aptos Narrow" w:eastAsia="Times New Roman" w:hAnsi="Aptos Narrow" w:cs="Times New Roman"/>
+          <w:b/>
+          <w:bCs/>
+          <w:color w:val="000000"/>
+          <w:kern w:val="0"/>
+          <w:sz w:val="22"/>
+          <w:szCs w:val="22"/>
+          <w14:ligatures w14:val="none"/>
+        </w:rPr>
+      </w:pPr>
+    </w:p>
+    <w:p>
+      <w:pPr>
+        <w:rPr>
+          <w:rFonts w:ascii="Aptos Narrow" w:eastAsia="Times New Roman" w:hAnsi="Aptos Narrow" w:cs="Times New Roman"/>
+          <w:b/>
+          <w:bCs/>
+          <w:color w:val="000000"/>
+          <w:kern w:val="0"/>
+          <w:sz w:val="22"/>
+          <w:szCs w:val="22"/>
+          <w14:ligatures w14:val="none"/>
+        </w:rPr>
+      </w:pPr>
+    </w:p>
+    <w:p>
+      <w:pPr>
+        <w:rPr>
+          <w:rFonts w:ascii="Aptos Narrow" w:eastAsia="Times New Roman" w:hAnsi="Aptos Narrow" w:cs="Times New Roman"/>
+          <w:b/>
+          <w:bCs/>
+          <w:color w:val="000000"/>
+          <w:kern w:val="0"/>
+          <w:sz w:val="22"/>
+          <w:szCs w:val="22"/>
+          <w14:ligatures w14:val="none"/>
+        </w:rPr>
+      </w:pPr>
+    </w:p>
+    <w:p>
+      <w:pPr>
+        <w:rPr>
+          <w:rFonts w:ascii="Aptos Narrow" w:eastAsia="Times New Roman" w:hAnsi="Aptos Narrow" w:cs="Times New Roman"/>
+          <w:b/>
+          <w:bCs/>
+          <w:color w:val="000000"/>
+          <w:kern w:val="0"/>
+          <w:sz w:val="22"/>
+          <w:szCs w:val="22"/>
+          <w14:ligatures w14:val="none"/>
+        </w:rPr>
+      </w:pPr>
+    </w:p>
+    <w:p>
+      <w:pPr>
+        <w:rPr>
+          <w:rFonts w:ascii="Aptos Narrow" w:eastAsia="Times New Roman" w:hAnsi="Aptos Narrow" w:cs="Times New Roman"/>
+          <w:b/>
+          <w:bCs/>
+          <w:color w:val="000000"/>
+          <w:kern w:val="0"/>
+          <w:sz w:val="22"/>
+          <w:szCs w:val="22"/>
+          <w14:ligatures w14:val="none"/>
+        </w:rPr>
+      </w:pPr>
+    </w:p>
+    <w:p>
+      <w:pPr>
+        <w:rPr>
+          <w:rFonts w:ascii="Aptos Narrow" w:eastAsia="Times New Roman" w:hAnsi="Aptos Narrow" w:cs="Times New Roman"/>
+          <w:b/>
+          <w:bCs/>
+          <w:color w:val="000000"/>
+          <w:kern w:val="0"/>
+          <w:sz w:val="22"/>
+          <w:szCs w:val="22"/>
+          <w14:ligatures w14:val="none"/>
+        </w:rPr>
+      </w:pPr>
+      <w:r>
+        <w:rPr>
+          <w:rFonts w:ascii="Aptos Narrow" w:eastAsia="Times New Roman" w:hAnsi="Aptos Narrow" w:cs="Times New Roman"/>
+          <w:b/>
+          <w:bCs/>
+          <w:color w:val="000000"/>
+          <w:kern w:val="0"/>
+          <w:sz w:val="22"/>
+          <w:szCs w:val="22"/>
+          <w14:ligatures w14:val="none"/>
+        </w:rPr>
+        <w:br w:type="page"/>
+      </w:r>
     </w:p>
     <w:p>
       <w:pPr>
@@ -1201,6 +1509,7 @@
           <w:szCs w:val="22"/>
           <w14:ligatures w14:val="none"/>
         </w:rPr>
+        <w:lastRenderedPageBreak/>
         <w:t>LANDING PAGE</w:t>
       </w:r>
     </w:p>
@@ -1237,7 +1546,6 @@
           <w14:ligatures w14:val="none"/>
         </w:rPr>
       </w:pPr>
-      <w:proofErr w:type="spellStart"/>
       <w:r>
         <w:rPr>
           <w:rFonts w:ascii="Aptos Narrow" w:eastAsia="Times New Roman" w:hAnsi="Aptos Narrow" w:cs="Times New Roman"/>
@@ -1262,21 +1570,7 @@
           <w:szCs w:val="22"/>
           <w14:ligatures w14:val="none"/>
         </w:rPr>
-        <w:t>Menu</w:t>
-      </w:r>
-      <w:proofErr w:type="spellEnd"/>
-      <w:r>
-        <w:rPr>
-          <w:rFonts w:ascii="Aptos Narrow" w:eastAsia="Times New Roman" w:hAnsi="Aptos Narrow" w:cs="Times New Roman"/>
-          <w:b/>
-          <w:bCs/>
-          <w:color w:val="000000"/>
-          <w:kern w:val="0"/>
-          <w:sz w:val="22"/>
-          <w:szCs w:val="22"/>
-          <w14:ligatures w14:val="none"/>
-        </w:rPr>
-        <w:t xml:space="preserve"> Section</w:t>
+        <w:t>shot of landing page</w:t>
       </w:r>
     </w:p>
     <w:p>
@@ -1308,7 +1602,7 @@
           <w:szCs w:val="22"/>
           <w14:ligatures w14:val="none"/>
         </w:rPr>
-        <w:t>Hero Section</w:t>
+        <w:t>Menu Section</w:t>
       </w:r>
     </w:p>
     <w:p>
@@ -1340,7 +1634,7 @@
           <w:szCs w:val="22"/>
           <w14:ligatures w14:val="none"/>
         </w:rPr>
-        <w:t>Corporate Video</w:t>
+        <w:t>Hero Section</w:t>
       </w:r>
     </w:p>
     <w:p>
@@ -1372,7 +1666,148 @@
           <w:szCs w:val="22"/>
           <w14:ligatures w14:val="none"/>
         </w:rPr>
-        <w:t>Main Section</w:t>
+        <w:t>About Me Section</w:t>
+      </w:r>
+    </w:p>
+    <w:p>
+      <w:pPr>
+        <w:pStyle w:val="ListParagraph"/>
+        <w:numPr>
+          <w:ilvl w:val="0"/>
+          <w:numId w:val="1"/>
+        </w:numPr>
+        <w:rPr>
+          <w:rFonts w:ascii="Aptos Narrow" w:eastAsia="Times New Roman" w:hAnsi="Aptos Narrow" w:cs="Times New Roman"/>
+          <w:b/>
+          <w:bCs/>
+          <w:color w:val="000000"/>
+          <w:kern w:val="0"/>
+          <w:sz w:val="22"/>
+          <w:szCs w:val="22"/>
+          <w14:ligatures w14:val="none"/>
+        </w:rPr>
+      </w:pPr>
+      <w:r>
+        <w:rPr>
+          <w:rFonts w:ascii="Aptos Narrow" w:eastAsia="Times New Roman" w:hAnsi="Aptos Narrow" w:cs="Times New Roman"/>
+          <w:b/>
+          <w:bCs/>
+          <w:color w:val="000000"/>
+          <w:kern w:val="0"/>
+          <w:sz w:val="22"/>
+          <w:szCs w:val="22"/>
+          <w14:ligatures w14:val="none"/>
+        </w:rPr>
+        <w:t>Skills Section</w:t>
+      </w:r>
+    </w:p>
+    <w:p>
+      <w:pPr>
+        <w:pStyle w:val="ListParagraph"/>
+        <w:numPr>
+          <w:ilvl w:val="0"/>
+          <w:numId w:val="1"/>
+        </w:numPr>
+        <w:rPr>
+          <w:rFonts w:ascii="Aptos Narrow" w:eastAsia="Times New Roman" w:hAnsi="Aptos Narrow" w:cs="Times New Roman"/>
+          <w:b/>
+          <w:bCs/>
+          <w:color w:val="000000"/>
+          <w:kern w:val="0"/>
+          <w:sz w:val="22"/>
+          <w:szCs w:val="22"/>
+          <w14:ligatures w14:val="none"/>
+        </w:rPr>
+      </w:pPr>
+      <w:r>
+        <w:rPr>
+          <w:rFonts w:ascii="Aptos Narrow" w:eastAsia="Times New Roman" w:hAnsi="Aptos Narrow" w:cs="Times New Roman"/>
+          <w:b/>
+          <w:bCs/>
+          <w:color w:val="000000"/>
+          <w:kern w:val="0"/>
+          <w:sz w:val="22"/>
+          <w:szCs w:val="22"/>
+          <w14:ligatures w14:val="none"/>
+        </w:rPr>
+        <w:t>Corporate Video</w:t>
+      </w:r>
+    </w:p>
+    <w:p>
+      <w:pPr>
+        <w:pStyle w:val="ListParagraph"/>
+        <w:numPr>
+          <w:ilvl w:val="0"/>
+          <w:numId w:val="1"/>
+        </w:numPr>
+        <w:rPr>
+          <w:rFonts w:ascii="Aptos Narrow" w:eastAsia="Times New Roman" w:hAnsi="Aptos Narrow" w:cs="Times New Roman"/>
+          <w:b/>
+          <w:bCs/>
+          <w:color w:val="000000"/>
+          <w:kern w:val="0"/>
+          <w:sz w:val="22"/>
+          <w:szCs w:val="22"/>
+          <w14:ligatures w14:val="none"/>
+        </w:rPr>
+      </w:pPr>
+      <w:r>
+        <w:rPr>
+          <w:rFonts w:ascii="Aptos Narrow" w:eastAsia="Times New Roman" w:hAnsi="Aptos Narrow" w:cs="Times New Roman"/>
+          <w:b/>
+          <w:bCs/>
+          <w:color w:val="000000"/>
+          <w:kern w:val="0"/>
+          <w:sz w:val="22"/>
+          <w:szCs w:val="22"/>
+          <w14:ligatures w14:val="none"/>
+        </w:rPr>
+        <w:t>Projects Section</w:t>
+      </w:r>
+    </w:p>
+    <w:p>
+      <w:pPr>
+        <w:pStyle w:val="ListParagraph"/>
+        <w:numPr>
+          <w:ilvl w:val="0"/>
+          <w:numId w:val="1"/>
+        </w:numPr>
+        <w:rPr>
+          <w:rFonts w:ascii="Aptos Narrow" w:eastAsia="Times New Roman" w:hAnsi="Aptos Narrow" w:cs="Times New Roman"/>
+          <w:b/>
+          <w:bCs/>
+          <w:color w:val="000000"/>
+          <w:kern w:val="0"/>
+          <w:sz w:val="22"/>
+          <w:szCs w:val="22"/>
+          <w14:ligatures w14:val="none"/>
+        </w:rPr>
+      </w:pPr>
+      <w:r>
+        <w:rPr>
+          <w:rFonts w:ascii="Aptos Narrow" w:eastAsia="Times New Roman" w:hAnsi="Aptos Narrow" w:cs="Times New Roman"/>
+          <w:b/>
+          <w:bCs/>
+          <w:color w:val="000000"/>
+          <w:kern w:val="0"/>
+          <w:sz w:val="22"/>
+          <w:szCs w:val="22"/>
+          <w14:ligatures w14:val="none"/>
+        </w:rPr>
+        <w:t>Contact</w:t>
+      </w:r>
+      <w:r>
+        <w:rPr>
+          <w:rFonts w:ascii="Aptos Narrow" w:eastAsia="Times New Roman" w:hAnsi="Aptos Narrow" w:cs="Times New Roman"/>
+          <w:b/>
+          <w:bCs/>
+          <w:color w:val="000000"/>
+          <w:kern w:val="0"/>
+          <w:sz w:val="22"/>
+          <w:szCs w:val="22"/>
+          <w14:ligatures w14:val="none"/>
+        </w:rPr>
+        <w:t xml:space="preserve"> Section</w:t>
       </w:r>
     </w:p>
     <w:p>
@@ -2629,6 +3064,96 @@
 <file path=word/numbering.xml><?xml version="1.0" encoding="utf-8"?>
 <w:numbering xmlns:wpc="http://schemas.microsoft.com/office/word/2010/wordprocessingCanvas" xmlns:cx="http://schemas.microsoft.com/office/drawing/2014/chartex" xmlns:cx1="http://schemas.microsoft.com/office/drawing/2015/9/8/chartex" xmlns:cx2="http://schemas.microsoft.com/office/drawing/2015/10/21/chartex" xmlns:cx3="http://schemas.microsoft.com/office/drawing/2016/5/9/chartex" xmlns:cx4="http://schemas.microsoft.com/office/drawing/2016/5/10/chartex" xmlns:cx5="http://schemas.microsoft.com/office/drawing/2016/5/11/chartex" xmlns:cx6="http://schemas.microsoft.com/office/drawing/2016/5/12/chartex" xmlns:cx7="http://schemas.microsoft.com/office/drawing/2016/5/13/chartex" xmlns:cx8="http://schemas.microsoft.com/office/drawing/2016/5/14/chartex" xmlns:mc="http://schemas.openxmlformats.org/markup-compatibility/2006" xmlns:aink="http://schemas.microsoft.com/office/drawing/2016/ink" xmlns:am3d="http://schemas.microsoft.com/office/drawing/2017/model3d" xmlns:o="urn:schemas-microsoft-com:office:office" xmlns:oel="http://schemas.microsoft.com/office/2019/extlst" xmlns:r="http://schemas.openxmlformats.org/officeDocument/2006/relationships" xmlns:m="http://schemas.openxmlformats.org/officeDocument/2006/math" xmlns:v="urn:schemas-microsoft-com:vml" xmlns:wp14="http://schemas.microsoft.com/office/word/2010/wordprocessingDrawing" xmlns:wp="http://schemas.openxmlformats.org/drawingml/2006/wordprocessingDrawing" xmlns:w10="urn:schemas-microsoft-com:office:word" xmlns:w="http://schemas.openxmlformats.org/wordprocessingml/2006/main" xmlns:w14="http://schemas.microsoft.com/office/word/2010/wordml" xmlns:w15="http://schemas.microsoft.com/office/word/2012/wordml" xmlns:w16cex="http://schemas.microsoft.com/office/word/2018/wordml/cex" xmlns:w16cid="http://schemas.microsoft.com/office/word/2016/wordml/cid" xmlns:w16="http://schemas.microsoft.com/office/word/2018/wordml" xmlns:w16du="http://schemas.microsoft.com/office/word/2023/wordml/word16du" xmlns:w16sdtdh="http://schemas.microsoft.com/office/word/2020/wordml/sdtdatahash" xmlns:w16sdtfl="http://schemas.microsoft.com/office/word/2024/wordml/sdtformatlock" xmlns:w16se="http://schemas.microsoft.com/office/word/2015/wordml/symex" xmlns:wpg="http://schemas.microsoft.com/office/word/2010/wordprocessingGroup" xmlns:wpi="http://schemas.microsoft.com/office/word/2010/wordprocessingInk" xmlns:wne="http://schemas.microsoft.com/office/word/2006/wordml" xmlns:wps="http://schemas.microsoft.com/office/word/2010/wordprocessingShape" mc:Ignorable="w14 w15 w16se w16cid w16 w16cex w16sdtdh w16sdtfl w16du wp14">
   <w:abstractNum w:abstractNumId="0" w15:restartNumberingAfterBreak="0">
+    <w:nsid w:val="16BA0D3D"/>
+    <w:multiLevelType w:val="hybridMultilevel"/>
+    <w:tmpl w:val="E5569EA6"/>
+    <w:lvl w:ilvl="0" w:tplc="D8D04874">
+      <w:start w:val="1"/>
+      <w:numFmt w:val="decimal"/>
+      <w:lvlText w:val="%1."/>
+      <w:lvlJc w:val="left"/>
+      <w:pPr>
+        <w:ind w:left="720" w:hanging="360"/>
+      </w:pPr>
+      <w:rPr>
+        <w:rFonts w:hint="default"/>
+        <w:b w:val="0"/>
+      </w:rPr>
+    </w:lvl>
+    <w:lvl w:ilvl="1" w:tplc="04090019" w:tentative="1">
+      <w:start w:val="1"/>
+      <w:numFmt w:val="lowerLetter"/>
+      <w:lvlText w:val="%2."/>
+      <w:lvlJc w:val="left"/>
+      <w:pPr>
+        <w:ind w:left="1440" w:hanging="360"/>
+      </w:pPr>
+    </w:lvl>
+    <w:lvl w:ilvl="2" w:tplc="0409001B" w:tentative="1">
+      <w:start w:val="1"/>
+      <w:numFmt w:val="lowerRoman"/>
+      <w:lvlText w:val="%3."/>
+      <w:lvlJc w:val="right"/>
+      <w:pPr>
+        <w:ind w:left="2160" w:hanging="180"/>
+      </w:pPr>
+    </w:lvl>
+    <w:lvl w:ilvl="3" w:tplc="0409000F" w:tentative="1">
+      <w:start w:val="1"/>
+      <w:numFmt w:val="decimal"/>
+      <w:lvlText w:val="%4."/>
+      <w:lvlJc w:val="left"/>
+      <w:pPr>
+        <w:ind w:left="2880" w:hanging="360"/>
+      </w:pPr>
+    </w:lvl>
+    <w:lvl w:ilvl="4" w:tplc="04090019" w:tentative="1">
+      <w:start w:val="1"/>
+      <w:numFmt w:val="lowerLetter"/>
+      <w:lvlText w:val="%5."/>
+      <w:lvlJc w:val="left"/>
+      <w:pPr>
+        <w:ind w:left="3600" w:hanging="360"/>
+      </w:pPr>
+    </w:lvl>
+    <w:lvl w:ilvl="5" w:tplc="0409001B" w:tentative="1">
+      <w:start w:val="1"/>
+      <w:numFmt w:val="lowerRoman"/>
+      <w:lvlText w:val="%6."/>
+      <w:lvlJc w:val="right"/>
+      <w:pPr>
+        <w:ind w:left="4320" w:hanging="180"/>
+      </w:pPr>
+    </w:lvl>
+    <w:lvl w:ilvl="6" w:tplc="0409000F" w:tentative="1">
+      <w:start w:val="1"/>
+      <w:numFmt w:val="decimal"/>
+      <w:lvlText w:val="%7."/>
+      <w:lvlJc w:val="left"/>
+      <w:pPr>
+        <w:ind w:left="5040" w:hanging="360"/>
+      </w:pPr>
+    </w:lvl>
+    <w:lvl w:ilvl="7" w:tplc="04090019" w:tentative="1">
+      <w:start w:val="1"/>
+      <w:numFmt w:val="lowerLetter"/>
+      <w:lvlText w:val="%8."/>
+      <w:lvlJc w:val="left"/>
+      <w:pPr>
+        <w:ind w:left="5760" w:hanging="360"/>
+      </w:pPr>
+    </w:lvl>
+    <w:lvl w:ilvl="8" w:tplc="0409001B" w:tentative="1">
+      <w:start w:val="1"/>
+      <w:numFmt w:val="lowerRoman"/>
+      <w:lvlText w:val="%9."/>
+      <w:lvlJc w:val="right"/>
+      <w:pPr>
+        <w:ind w:left="6480" w:hanging="180"/>
+      </w:pPr>
+    </w:lvl>
+  </w:abstractNum>
+  <w:abstractNum w:abstractNumId="1" w15:restartNumberingAfterBreak="0">
     <w:nsid w:val="71855758"/>
     <w:multiLevelType w:val="hybridMultilevel"/>
     <w:tmpl w:val="89D88DF0"/>
@@ -2742,6 +3267,9 @@
     </w:lvl>
   </w:abstractNum>
   <w:num w:numId="1" w16cid:durableId="679434833">
+    <w:abstractNumId w:val="1"/>
+  </w:num>
+  <w:num w:numId="2" w16cid:durableId="1019239650">
     <w:abstractNumId w:val="0"/>
   </w:num>
 </w:numbering>

</xml_diff>

<commit_message>
Update index.html for improved layout and add new project sections; update dewey-documentation.docx
</commit_message>
<xml_diff>
--- a/dewey-documentation.docx
+++ b/dewey-documentation.docx
@@ -1756,7 +1756,7 @@
           <w:ilvl w:val="1"/>
           <w:numId w:val="3"/>
         </w:numPr>
-        <w:ind w:left="1530" w:hanging="1530"/>
+        <w:ind w:left="1530" w:hanging="1260"/>
         <w:rPr>
           <w:rFonts w:ascii="Aptos Narrow" w:eastAsia="Times New Roman" w:hAnsi="Aptos Narrow" w:cs="Times New Roman"/>
           <w:color w:val="000000"/>
@@ -1796,7 +1796,7 @@
           <w:ilvl w:val="2"/>
           <w:numId w:val="3"/>
         </w:numPr>
-        <w:ind w:left="1530" w:hanging="1080"/>
+        <w:ind w:left="1530" w:hanging="900"/>
         <w:rPr>
           <w:rFonts w:ascii="Aptos Narrow" w:eastAsia="Times New Roman" w:hAnsi="Aptos Narrow" w:cs="Times New Roman"/>
           <w:color w:val="000000"/>
@@ -1825,7 +1825,7 @@
           <w:ilvl w:val="2"/>
           <w:numId w:val="3"/>
         </w:numPr>
-        <w:ind w:left="1530" w:hanging="1080"/>
+        <w:ind w:left="1530" w:hanging="900"/>
         <w:rPr>
           <w:rFonts w:ascii="Aptos Narrow" w:eastAsia="Times New Roman" w:hAnsi="Aptos Narrow" w:cs="Times New Roman"/>
           <w:color w:val="000000"/>
@@ -1854,7 +1854,7 @@
           <w:ilvl w:val="2"/>
           <w:numId w:val="3"/>
         </w:numPr>
-        <w:ind w:left="1530" w:hanging="1080"/>
+        <w:ind w:left="1530" w:hanging="900"/>
         <w:rPr>
           <w:rFonts w:ascii="Aptos Narrow" w:eastAsia="Times New Roman" w:hAnsi="Aptos Narrow" w:cs="Times New Roman"/>
           <w:color w:val="000000"/>
@@ -1883,7 +1883,7 @@
           <w:ilvl w:val="2"/>
           <w:numId w:val="3"/>
         </w:numPr>
-        <w:ind w:left="1530" w:hanging="1080"/>
+        <w:ind w:left="1530" w:hanging="900"/>
         <w:rPr>
           <w:rFonts w:ascii="Aptos Narrow" w:eastAsia="Times New Roman" w:hAnsi="Aptos Narrow" w:cs="Times New Roman"/>
           <w:color w:val="000000"/>
@@ -1912,7 +1912,7 @@
           <w:ilvl w:val="2"/>
           <w:numId w:val="3"/>
         </w:numPr>
-        <w:ind w:left="1530" w:hanging="1080"/>
+        <w:ind w:left="1530" w:hanging="900"/>
         <w:rPr>
           <w:rFonts w:ascii="Aptos Narrow" w:eastAsia="Times New Roman" w:hAnsi="Aptos Narrow" w:cs="Times New Roman"/>
           <w:color w:val="000000"/>
@@ -1941,7 +1941,7 @@
           <w:ilvl w:val="2"/>
           <w:numId w:val="3"/>
         </w:numPr>
-        <w:ind w:left="1530" w:hanging="1080"/>
+        <w:ind w:left="1530" w:hanging="900"/>
         <w:rPr>
           <w:rFonts w:ascii="Aptos Narrow" w:eastAsia="Times New Roman" w:hAnsi="Aptos Narrow" w:cs="Times New Roman"/>
           <w:color w:val="000000"/>
@@ -1970,7 +1970,7 @@
           <w:ilvl w:val="1"/>
           <w:numId w:val="3"/>
         </w:numPr>
-        <w:ind w:left="1530" w:hanging="1530"/>
+        <w:ind w:left="1530" w:hanging="1260"/>
         <w:rPr>
           <w:rFonts w:ascii="Aptos Narrow" w:eastAsia="Times New Roman" w:hAnsi="Aptos Narrow" w:cs="Times New Roman"/>
           <w:color w:val="000000"/>
@@ -1999,7 +1999,7 @@
           <w:ilvl w:val="2"/>
           <w:numId w:val="3"/>
         </w:numPr>
-        <w:ind w:left="1530" w:hanging="1080"/>
+        <w:ind w:left="1530" w:hanging="900"/>
         <w:rPr>
           <w:rFonts w:ascii="Aptos Narrow" w:eastAsia="Times New Roman" w:hAnsi="Aptos Narrow" w:cs="Times New Roman"/>
           <w:color w:val="000000"/>
@@ -2028,7 +2028,7 @@
           <w:ilvl w:val="2"/>
           <w:numId w:val="3"/>
         </w:numPr>
-        <w:ind w:left="1530" w:hanging="1080"/>
+        <w:ind w:left="1530" w:hanging="900"/>
         <w:rPr>
           <w:rFonts w:ascii="Aptos Narrow" w:eastAsia="Times New Roman" w:hAnsi="Aptos Narrow" w:cs="Times New Roman"/>
           <w:color w:val="000000"/>
@@ -2057,7 +2057,7 @@
           <w:ilvl w:val="2"/>
           <w:numId w:val="3"/>
         </w:numPr>
-        <w:ind w:left="1530" w:hanging="1080"/>
+        <w:ind w:left="1530" w:hanging="900"/>
         <w:rPr>
           <w:rFonts w:ascii="Aptos Narrow" w:eastAsia="Times New Roman" w:hAnsi="Aptos Narrow" w:cs="Times New Roman"/>
           <w:color w:val="000000"/>
@@ -2086,7 +2086,7 @@
           <w:ilvl w:val="2"/>
           <w:numId w:val="3"/>
         </w:numPr>
-        <w:ind w:left="1530" w:hanging="1080"/>
+        <w:ind w:left="1530" w:hanging="900"/>
         <w:rPr>
           <w:rFonts w:ascii="Aptos Narrow" w:eastAsia="Times New Roman" w:hAnsi="Aptos Narrow" w:cs="Times New Roman"/>
           <w:color w:val="000000"/>
@@ -2115,7 +2115,7 @@
           <w:ilvl w:val="2"/>
           <w:numId w:val="3"/>
         </w:numPr>
-        <w:ind w:left="1530" w:hanging="1080"/>
+        <w:ind w:left="1530" w:hanging="900"/>
         <w:rPr>
           <w:rFonts w:ascii="Aptos Narrow" w:eastAsia="Times New Roman" w:hAnsi="Aptos Narrow" w:cs="Times New Roman"/>
           <w:color w:val="000000"/>
@@ -2144,7 +2144,7 @@
           <w:ilvl w:val="1"/>
           <w:numId w:val="3"/>
         </w:numPr>
-        <w:ind w:left="1530" w:hanging="1530"/>
+        <w:ind w:left="1530" w:hanging="1260"/>
         <w:rPr>
           <w:rFonts w:ascii="Aptos Narrow" w:eastAsia="Times New Roman" w:hAnsi="Aptos Narrow" w:cs="Times New Roman"/>
           <w:color w:val="000000"/>
@@ -2173,7 +2173,7 @@
           <w:ilvl w:val="2"/>
           <w:numId w:val="3"/>
         </w:numPr>
-        <w:ind w:left="1530" w:hanging="1530"/>
+        <w:ind w:left="1530" w:hanging="900"/>
         <w:rPr>
           <w:rFonts w:ascii="Aptos Narrow" w:eastAsia="Times New Roman" w:hAnsi="Aptos Narrow" w:cs="Times New Roman"/>
           <w:color w:val="000000"/>
@@ -2191,7 +2191,7 @@
           <w:ilvl w:val="1"/>
           <w:numId w:val="3"/>
         </w:numPr>
-        <w:ind w:left="1530" w:hanging="1530"/>
+        <w:ind w:left="1530" w:hanging="1260"/>
         <w:rPr>
           <w:rFonts w:ascii="Aptos Narrow" w:eastAsia="Times New Roman" w:hAnsi="Aptos Narrow" w:cs="Times New Roman"/>
           <w:color w:val="000000"/>
@@ -2220,7 +2220,7 @@
           <w:ilvl w:val="1"/>
           <w:numId w:val="3"/>
         </w:numPr>
-        <w:ind w:left="1530" w:hanging="1530"/>
+        <w:ind w:left="1530" w:hanging="1260"/>
         <w:rPr>
           <w:rFonts w:ascii="Aptos Narrow" w:eastAsia="Times New Roman" w:hAnsi="Aptos Narrow" w:cs="Times New Roman"/>
           <w:color w:val="000000"/>
@@ -2249,7 +2249,7 @@
           <w:ilvl w:val="1"/>
           <w:numId w:val="3"/>
         </w:numPr>
-        <w:ind w:left="1530" w:hanging="1530"/>
+        <w:ind w:left="1530" w:hanging="1260"/>
         <w:rPr>
           <w:rFonts w:ascii="Aptos Narrow" w:eastAsia="Times New Roman" w:hAnsi="Aptos Narrow" w:cs="Times New Roman"/>
           <w:color w:val="000000"/>
@@ -2278,7 +2278,7 @@
           <w:ilvl w:val="1"/>
           <w:numId w:val="3"/>
         </w:numPr>
-        <w:ind w:left="1530" w:hanging="1530"/>
+        <w:ind w:left="1530" w:hanging="1260"/>
         <w:rPr>
           <w:rFonts w:ascii="Aptos Narrow" w:eastAsia="Times New Roman" w:hAnsi="Aptos Narrow" w:cs="Times New Roman"/>
           <w:color w:val="000000"/>
@@ -2307,7 +2307,7 @@
           <w:ilvl w:val="1"/>
           <w:numId w:val="3"/>
         </w:numPr>
-        <w:ind w:left="1530" w:hanging="1530"/>
+        <w:ind w:left="1530" w:hanging="1260"/>
         <w:rPr>
           <w:rFonts w:ascii="Aptos Narrow" w:eastAsia="Times New Roman" w:hAnsi="Aptos Narrow" w:cs="Times New Roman"/>
           <w:color w:val="000000"/>
@@ -2646,6 +2646,20 @@
         </w:rPr>
         <w:t xml:space="preserve"> PAGE</w:t>
       </w:r>
+    </w:p>
+    <w:p>
+      <w:pPr>
+        <w:rPr>
+          <w:rFonts w:ascii="Aptos Narrow" w:eastAsia="Times New Roman" w:hAnsi="Aptos Narrow" w:cs="Times New Roman"/>
+          <w:b/>
+          <w:bCs/>
+          <w:color w:val="000000"/>
+          <w:kern w:val="0"/>
+          <w:sz w:val="28"/>
+          <w:szCs w:val="28"/>
+          <w14:ligatures w14:val="none"/>
+        </w:rPr>
+      </w:pPr>
     </w:p>
     <w:p>
       <w:pPr>
@@ -4407,7 +4421,7 @@
           <w:ilvl w:val="2"/>
           <w:numId w:val="9"/>
         </w:numPr>
-        <w:ind w:left="2340" w:hanging="1620"/>
+        <w:ind w:left="720" w:hanging="720"/>
         <w:rPr>
           <w:rFonts w:ascii="Aptos Narrow" w:eastAsia="Times New Roman" w:hAnsi="Aptos Narrow" w:cs="Times New Roman"/>
           <w:b/>
@@ -4435,7 +4449,6 @@
     </w:p>
     <w:p>
       <w:pPr>
-        <w:ind w:left="720"/>
         <w:rPr>
           <w:rFonts w:ascii="Aptos Narrow" w:eastAsia="Times New Roman" w:hAnsi="Aptos Narrow" w:cs="Times New Roman"/>
           <w:color w:val="000000"/>
@@ -5782,6 +5795,7 @@
           <w:ilvl w:val="1"/>
           <w:numId w:val="7"/>
         </w:numPr>
+        <w:ind w:left="1620" w:hanging="1260"/>
         <w:rPr>
           <w:rFonts w:ascii="Aptos Narrow" w:eastAsia="Times New Roman" w:hAnsi="Aptos Narrow" w:cs="Times New Roman"/>
           <w:color w:val="000000"/>

</xml_diff>